<commit_message>
Fill seller requisites in RVB claim from WB API data
Address, phone, e-mail, bank details, signatory title and executor taken
from WB documents (acquiring report, UPD) and user-management API.

Co-Authored-By: Claude Opus 5.5 <noreply@anthropic.com>
Claude-Session: https://claude.ai/code/session_01UccTQVVwgWNZQb7BMuzChR
</commit_message>
<xml_diff>
--- a/pretenziya_RVB_MI-TEKS.docx
+++ b/pretenziya_RVB_MI-TEKS.docx
@@ -92,7 +92,7 @@
                 <w:sz w:val="24"/>
                 <w:szCs w:val="24"/>
               </w:rPr>
-              <w:t xml:space="preserve">Адрес: [_____]</w:t>
+              <w:t xml:space="preserve">Адрес: 153000, Ивановская обл., г. Иваново, ул. Станко, д. 36, офис 1</w:t>
             </w:r>
           </w:p>
           <w:p>
@@ -106,7 +106,7 @@
                 <w:sz w:val="24"/>
                 <w:szCs w:val="24"/>
               </w:rPr>
-              <w:t xml:space="preserve">Тел.: [_____], e-mail: [_____]</w:t>
+              <w:t xml:space="preserve">Тел.: +7 996 919-97-13, e-mail: 12_04_84@mail.ru</w:t>
             </w:r>
           </w:p>
           <w:p>
@@ -294,7 +294,7 @@
           <w:sz w:val="28"/>
           <w:szCs w:val="28"/>
         </w:rPr>
-        <w:t xml:space="preserve">Между ООО «МИ-ТЕКС» (далее — Продавец) и ООО «РВБ» (далее — Вайлдберриз) заключён договор путём акцепта Продавцом [_____] оферты о реализации товара на сайте WILDBERRIES (seller.wildberries.ru/terms, далее — Оферта). Во исполнение Оферты Продавец передал товар на склады Вайлдберриз для продажи со склада Вайлдберриз.</w:t>
+        <w:t xml:space="preserve">Между ООО «МИ-ТЕКС» (далее — Продавец) и ООО «РВБ» (далее — Вайлдберриз) заключён договор путём акцепта Продавцом оферты о реализации товара на сайте WILDBERRIES (seller.wildberries.ru/terms, далее — Оферта). Во исполнение Оферты Продавец передал товар на склады Вайлдберриз для продажи со склада Вайлдберриз.</w:t>
       </w:r>
     </w:p>
     <w:p>
@@ -2415,7 +2415,7 @@
           <w:sz w:val="28"/>
           <w:szCs w:val="28"/>
         </w:rPr>
-        <w:t xml:space="preserve"> путём перечисления на расчётный счёт [_____] в [_____], БИК [_____], к/с [_____] либо путём отражения суммы в личном кабинете Продавца как доступной к выводу (п. 11.3.9 Оферты).</w:t>
+        <w:t xml:space="preserve"> путём перечисления на расчётный счёт 40702810820000327823 в ООО «Банк Точка», БИК 044525104, к/с 30101810745374525104, либо путём отражения суммы в личном кабинете Продавца как доступной к выводу (п. 11.3.9 Оферты).</w:t>
       </w:r>
     </w:p>
     <w:p>
@@ -2518,7 +2518,7 @@
           <w:sz w:val="28"/>
           <w:szCs w:val="28"/>
         </w:rPr>
-        <w:t xml:space="preserve">[Должность]</w:t>
+        <w:t xml:space="preserve">Генеральный директор</w:t>
       </w:r>
       <w:r>
         <w:rPr>
@@ -2566,7 +2566,7 @@
           <w:sz w:val="20"/>
           <w:szCs w:val="20"/>
         </w:rPr>
-        <w:t xml:space="preserve">Исп.: [_____], тел. [_____]</w:t>
+        <w:t xml:space="preserve">Исп.: Белькова Ю.С., тел. +7 920 345-12-35</w:t>
       </w:r>
     </w:p>
     <w:p>
@@ -8711,7 +8711,7 @@
           <w:sz w:val="24"/>
           <w:szCs w:val="24"/>
         </w:rPr>
-        <w:t xml:space="preserve">[Должность]</w:t>
+        <w:t xml:space="preserve">Генеральный директор</w:t>
       </w:r>
       <w:r>
         <w:rPr>

</xml_diff>

<commit_message>
Add OGRN and director to RVB claim, drop executor line
Co-Authored-By: Claude Opus 5.5 <noreply@anthropic.com>
Claude-Session: https://claude.ai/code/session_01UccTQVVwgWNZQb7BMuzChR
</commit_message>
<xml_diff>
--- a/pretenziya_RVB_MI-TEKS.docx
+++ b/pretenziya_RVB_MI-TEKS.docx
@@ -64,7 +64,7 @@
                 <w:sz w:val="24"/>
                 <w:szCs w:val="24"/>
               </w:rPr>
-              <w:t xml:space="preserve">ОГРН [_____]</w:t>
+              <w:t xml:space="preserve">ОГРН 1233700002854</w:t>
             </w:r>
           </w:p>
           <w:p>
@@ -2534,7 +2534,7 @@
           <w:sz w:val="28"/>
           <w:szCs w:val="28"/>
         </w:rPr>
-        <w:t xml:space="preserve">[И.О. Фамилия]</w:t>
+        <w:t xml:space="preserve">Д.А. Логинов</w:t>
       </w:r>
     </w:p>
     <w:p>
@@ -2554,19 +2554,6 @@
           <w:szCs w:val="28"/>
         </w:rPr>
         <w:t xml:space="preserve">М.П.</w:t>
-      </w:r>
-    </w:p>
-    <w:p>
-      <w:pPr>
-        <w:spacing w:before="240" w:line="240"/>
-      </w:pPr>
-      <w:r>
-        <w:rPr>
-          <w:rFonts w:ascii="Times New Roman" w:cs="Times New Roman" w:eastAsia="Times New Roman" w:hAnsi="Times New Roman"/>
-          <w:sz w:val="20"/>
-          <w:szCs w:val="20"/>
-        </w:rPr>
-        <w:t xml:space="preserve">Исп.: Белькова Ю.С., тел. +7 920 345-12-35</w:t>
       </w:r>
     </w:p>
     <w:p>
@@ -8727,7 +8714,7 @@
           <w:sz w:val="24"/>
           <w:szCs w:val="24"/>
         </w:rPr>
-        <w:t xml:space="preserve">[И.О. Фамилия]</w:t>
+        <w:t xml:space="preserve">Д.А. Логинов</w:t>
       </w:r>
     </w:p>
     <w:p>

</xml_diff>

<commit_message>
Restore executor line in RVB claim
Co-Authored-By: Claude Opus 5.5 <noreply@anthropic.com>
Claude-Session: https://claude.ai/code/session_01UccTQVVwgWNZQb7BMuzChR
</commit_message>
<xml_diff>
--- a/pretenziya_RVB_MI-TEKS.docx
+++ b/pretenziya_RVB_MI-TEKS.docx
@@ -2554,6 +2554,19 @@
           <w:szCs w:val="28"/>
         </w:rPr>
         <w:t xml:space="preserve">М.П.</w:t>
+      </w:r>
+    </w:p>
+    <w:p>
+      <w:pPr>
+        <w:spacing w:before="240" w:line="240"/>
+      </w:pPr>
+      <w:r>
+        <w:rPr>
+          <w:rFonts w:ascii="Times New Roman" w:cs="Times New Roman" w:eastAsia="Times New Roman" w:hAnsi="Times New Roman"/>
+          <w:sz w:val="20"/>
+          <w:szCs w:val="20"/>
+        </w:rPr>
+        <w:t xml:space="preserve">Исп.: Белькова Ю.С., тел. +7 920 345-12-35</w:t>
       </w:r>
     </w:p>
     <w:p>

</xml_diff>